<commit_message>
Cap nhat 233 cau chuan tu file Word: danh so 4 cau khuyet, dong bo 100% cau hoi va dap an
</commit_message>
<xml_diff>
--- a/GỘP CHỦ NGHĨA XÃ HỘI KHOA HỌC - BÀI 1 2 3 4 5 6.docx
+++ b/GỘP CHỦ NGHĨA XÃ HỘI KHOA HỌC - BÀI 1 2 3 4 5 6.docx
@@ -17244,7 +17244,7 @@
           <w:szCs w:val="24"/>
           <w:rtl w:val="0"/>
         </w:rPr>
-        <w:t xml:space="preserve">Câu : Vận dụng những kiến thức đã học hãy chọn phương án đúng về mối quan hệ giữa dân chủ xã hội chủ nghĩa và  xã hội chủ nghĩa?</w:t>
+        <w:t>Câu 32: Vận dụng những kiến thức đã học hãy chọn phương án đúng về mối quan hệ giữa dân chủ xã hội chủ nghĩa và  xã hội chủ nghĩa?</w:t>
       </w:r>
     </w:p>
     <w:p>
@@ -26819,7 +26819,7 @@
           <w:szCs w:val="24"/>
           <w:rtl w:val="0"/>
         </w:rPr>
-        <w:t xml:space="preserve">Câu : Kéo thả</w:t>
+        <w:t>Câu 45: Kéo thả</w:t>
       </w:r>
     </w:p>
     <w:p>
@@ -32638,7 +32638,7 @@
           <w:szCs w:val="24"/>
           <w:rtl w:val="0"/>
         </w:rPr>
-        <w:t xml:space="preserve">Câu : Kéo thả các đáp án khớp với các phát biểu</w:t>
+        <w:t>Câu 38: Kéo thả các đáp án khớp với các phát biểu</w:t>
       </w:r>
     </w:p>
     <w:p>
@@ -32969,8 +32969,8 @@
           <w:szCs w:val="24"/>
           <w:rtl w:val="0"/>
         </w:rPr>
-        <w:br w:type="textWrapping"/>
-        <w:t xml:space="preserve">Câu : Kéo thả các đáp án khớp với các phát biểu về tôn giáo, tín ngưỡng dưới đây:</w:t>
+        <w:br/>
+        <w:t>Câu 39: Kéo thả các đáp án khớp với các phát biểu về tôn giáo, tín ngưỡng dưới đây:</w:t>
       </w:r>
     </w:p>
     <w:p>

</xml_diff>